<commit_message>
deploy: publish Volyx Lens portfolio update
</commit_message>
<xml_diff>
--- a/Joshua_Nwachinemere_CV.docx
+++ b/Joshua_Nwachinemere_CV.docx
@@ -33,6 +33,9 @@
         <w:spacing w:after="0"/>
         <w:jc w:val="center"/>
       </w:pPr>
+      <w:r>
+        <w:t xml:space="preserve">Lagos, Nigeria | Open to UK relocation | </w:t>
+      </w:r>
       <w:hyperlink r:id="rId10">
         <w:r>
           <w:rPr>
@@ -57,7 +60,7 @@
             <w:color w:val="1155CC"/>
             <w:u w:val="single"/>
           </w:rPr>
-          <w:t>GitHub</w:t>
+          <w:t>github.com/dk3yyyy</w:t>
         </w:r>
       </w:hyperlink>
       <w:r>
@@ -69,7 +72,7 @@
             <w:color w:val="1155CC"/>
             <w:u w:val="single"/>
           </w:rPr>
-          <w:t>LinkedIn</w:t>
+          <w:t>linkedin.com/in/joshua-nwachinemere</w:t>
         </w:r>
       </w:hyperlink>
       <w:r>
@@ -81,7 +84,7 @@
             <w:color w:val="1155CC"/>
             <w:u w:val="single"/>
           </w:rPr>
-          <w:t>Portfolio</w:t>
+          <w:t>dk3yyyy.github.io/joshua-portfolio</w:t>
         </w:r>
       </w:hyperlink>
     </w:p>
@@ -102,7 +105,64 @@
         <w:spacing w:after="40"/>
       </w:pPr>
       <w:r>
-        <w:t>AI Engineer and VolyxAI founder building practical AI, automation, and backend systems with Python. Work includes machine-learning pipelines, local retrieval, event-driven workflows, real-time services, and API integrations. Focused on systems that validate model output, preserve execution context, and keep people responsible for consequential actions.</w:t>
+        <w:t>AI Engineer and VolyxAI founder building applied AI, backend services, and automation systems with Python, JavaScript, and TypeScript. Experience includes a multimodal macOS assistant, retrieval workflows, real-time applications, ML evaluation, API integrations, and human-in-the-loop automation.</w:t>
+      </w:r>
+    </w:p>
+    <w:p>
+      <w:pPr>
+        <w:spacing w:before="120" w:after="40"/>
+      </w:pPr>
+      <w:r>
+        <w:rPr>
+          <w:b/>
+          <w:sz w:val="23"/>
+        </w:rPr>
+        <w:t>CORE SKILLS</w:t>
+      </w:r>
+    </w:p>
+    <w:p>
+      <w:pPr>
+        <w:spacing w:after="0"/>
+        <w:ind w:left="288" w:hanging="173"/>
+      </w:pPr>
+      <w:r>
+        <w:t>- Languages: Python, JavaScript, TypeScript, SQL</w:t>
+      </w:r>
+    </w:p>
+    <w:p>
+      <w:pPr>
+        <w:spacing w:after="0"/>
+        <w:ind w:left="288" w:hanging="173"/>
+      </w:pPr>
+      <w:r>
+        <w:t>- AI / ML: Azure AI Foundry, XGBoost, scikit-learn, pandas, Ollama, LangChain, Chroma, RAG, model evaluation</w:t>
+      </w:r>
+    </w:p>
+    <w:p>
+      <w:pPr>
+        <w:spacing w:after="0"/>
+        <w:ind w:left="288" w:hanging="173"/>
+      </w:pPr>
+      <w:r>
+        <w:t>- Backend &amp; Automation: FastAPI, Express, Socket.IO, n8n, REST APIs, webhooks, SQLAlchemy, SQLite</w:t>
+      </w:r>
+    </w:p>
+    <w:p>
+      <w:pPr>
+        <w:spacing w:after="0"/>
+        <w:ind w:left="288" w:hanging="173"/>
+      </w:pPr>
+      <w:r>
+        <w:t>- Infrastructure: Docker, GitHub Actions, Linux, Microsoft Azure, Electron</w:t>
+      </w:r>
+    </w:p>
+    <w:p>
+      <w:pPr>
+        <w:spacing w:after="0"/>
+        <w:ind w:left="288" w:hanging="173"/>
+      </w:pPr>
+      <w:r>
+        <w:t>- Security: Suricata, Snort, VirusTotal API, OSINT, DNS analysis, secure credential management</w:t>
       </w:r>
     </w:p>
     <w:p>
@@ -144,42 +204,29 @@
     </w:p>
     <w:p>
       <w:pPr>
-        <w:pStyle w:val="ListBullet"/>
         <w:spacing w:after="0"/>
         <w:ind w:left="288" w:hanging="173"/>
       </w:pPr>
       <w:r>
-        <w:t>Designing early-stage operations workflows that connect conversation intake to validation, approval, and context-rich handoff steps.</w:t>
+        <w:t>- Built and tested controlled workflow prototypes connecting conversational intake to schema validation, calendar scheduling, email confirmation, and approval-based handoffs.</w:t>
       </w:r>
     </w:p>
     <w:p>
       <w:pPr>
-        <w:pStyle w:val="ListBullet"/>
         <w:spacing w:after="0"/>
         <w:ind w:left="288" w:hanging="173"/>
       </w:pPr>
       <w:r>
-        <w:t>Built n8n workflow prototypes that connect language models with calendars, email, webhooks, and structured business rules in controlled test environments.</w:t>
+        <w:t>- Integrated language models, n8n, webhooks, Vapi, ElevenLabs, Google Calendar, and email services in controlled test environments.</w:t>
       </w:r>
     </w:p>
     <w:p>
       <w:pPr>
-        <w:pStyle w:val="ListBullet"/>
         <w:spacing w:after="0"/>
         <w:ind w:left="288" w:hanging="173"/>
       </w:pPr>
       <w:r>
-        <w:t>Prototyped a voice-led scheduling flow using Vapi, ElevenLabs, n8n, Google Calendar, and email confirmation integrations.</w:t>
-      </w:r>
-    </w:p>
-    <w:p>
-      <w:pPr>
-        <w:pStyle w:val="ListBullet"/>
-        <w:spacing w:after="0"/>
-        <w:ind w:left="288" w:hanging="173"/>
-      </w:pPr>
-      <w:r>
-        <w:t>Defined input validation, retry limits, idempotency controls, and human approval requirements for consequential workflow actions.</w:t>
+        <w:t>- Designed deterministic validation, bounded retries, idempotency controls, and human approval for consequential actions.</w:t>
       </w:r>
     </w:p>
     <w:p>
@@ -204,7 +251,7 @@
         <w:rPr>
           <w:b/>
         </w:rPr>
-        <w:t>Software &amp; Automation Developer</w:t>
+        <w:t>Independent Software &amp; Automation Developer</w:t>
       </w:r>
       <w:r>
         <w:rPr>
@@ -218,47 +265,34 @@
         <w:spacing w:after="0"/>
       </w:pPr>
       <w:r>
-        <w:t>Freelance / Self-Employed</w:t>
+        <w:t>Self-Employed / Independent Projects</w:t>
       </w:r>
     </w:p>
     <w:p>
       <w:pPr>
-        <w:pStyle w:val="ListBullet"/>
         <w:spacing w:after="0"/>
         <w:ind w:left="288" w:hanging="173"/>
       </w:pPr>
       <w:r>
-        <w:t>Built Python automation and backend utilities for data processing, Telegram bots, API integrations, and operational tooling.</w:t>
+        <w:t>- Built Python automation and backend utilities for data processing, Telegram bots, API integrations, and operational tooling.</w:t>
       </w:r>
     </w:p>
     <w:p>
       <w:pPr>
-        <w:pStyle w:val="ListBullet"/>
         <w:spacing w:after="0"/>
         <w:ind w:left="288" w:hanging="173"/>
       </w:pPr>
       <w:r>
-        <w:t>Developed stream-oriented utilities for processing and splitting large text datasets without loading complete files into memory.</w:t>
+        <w:t>- Developed stream-oriented utilities for processing large text datasets without loading complete files into memory.</w:t>
       </w:r>
     </w:p>
     <w:p>
       <w:pPr>
-        <w:pStyle w:val="ListBullet"/>
         <w:spacing w:after="0"/>
         <w:ind w:left="288" w:hanging="173"/>
       </w:pPr>
       <w:r>
-        <w:t>Created asynchronous Telegram integrations for wallet analysis, malware scanning, user tracking, pagination, caching, and admin reporting.</w:t>
-      </w:r>
-    </w:p>
-    <w:p>
-      <w:pPr>
-        <w:pStyle w:val="ListBullet"/>
-        <w:spacing w:after="0"/>
-        <w:ind w:left="288" w:hanging="173"/>
-      </w:pPr>
-      <w:r>
-        <w:t>Built public Python tools for DNS intelligence, multi-source wallet analysis, and malware-report delivery.</w:t>
+        <w:t>- Created asynchronous integrations for wallet analysis, malware scanning, user tracking, pagination, caching, and admin reporting.</w:t>
       </w:r>
     </w:p>
     <w:p>
@@ -277,13 +311,25 @@
     </w:p>
     <w:p>
       <w:pPr>
+        <w:spacing w:before="120" w:after="40"/>
+      </w:pPr>
+      <w:r>
+        <w:rPr>
+          <w:b/>
+          <w:sz w:val="23"/>
+        </w:rPr>
+        <w:t>TECHNICAL TRAINING</w:t>
+      </w:r>
+    </w:p>
+    <w:p>
+      <w:pPr>
         <w:spacing w:after="0"/>
       </w:pPr>
       <w:r>
         <w:rPr>
           <w:b/>
         </w:rPr>
-        <w:t>Threat Detection &amp; Response Lab</w:t>
+        <w:t>Threat Detection &amp; Response Capstone | Capstone IT Staffing (Remote)</w:t>
       </w:r>
       <w:r>
         <w:rPr>
@@ -295,43 +341,19 @@
     <w:p>
       <w:pPr>
         <w:spacing w:after="0"/>
+        <w:ind w:left="288" w:hanging="173"/>
       </w:pPr>
       <w:r>
-        <w:t>Capstone IT Staffing | Remote</w:t>
+        <w:t>- Deployed Suricata on Ubuntu, wrote custom Snort rules, and automated alert enrichment with Python and public OSINT sources.</w:t>
       </w:r>
     </w:p>
     <w:p>
       <w:pPr>
-        <w:pStyle w:val="ListBullet"/>
         <w:spacing w:after="0"/>
         <w:ind w:left="288" w:hanging="173"/>
       </w:pPr>
       <w:r>
-        <w:t>Deployed Suricata IDS on Ubuntu, wrote custom Snort rules, and automated alert enrichment with Python and public OSINT sources.</w:t>
-      </w:r>
-    </w:p>
-    <w:p>
-      <w:pPr>
-        <w:pStyle w:val="ListBullet"/>
-        <w:spacing w:after="0"/>
-        <w:ind w:left="288" w:hanging="173"/>
-      </w:pPr>
-      <w:r>
-        <w:t>Built a Python DNS intelligence CLI with asynchronous resolution, WHOIS lookups, trace output, and JSON export for investigations.</w:t>
-      </w:r>
-    </w:p>
-    <w:p>
-      <w:pPr>
-        <w:spacing w:after="40"/>
-      </w:pPr>
-      <w:r>
-        <w:rPr>
-          <w:b/>
-        </w:rPr>
-        <w:t xml:space="preserve">Key tools: </w:t>
-      </w:r>
-      <w:r>
-        <w:t>Python, Suricata, Snort, OSINT, DNS, Linux</w:t>
+        <w:t>- Built a DNS intelligence CLI with asynchronous resolution, WHOIS lookups, trace output, and JSON export.</w:t>
       </w:r>
     </w:p>
     <w:p>
@@ -359,7 +381,7 @@
         <w:rPr>
           <w:b/>
         </w:rPr>
-        <w:t>Noughtline | Real-Time Multiplayer System</w:t>
+        <w:t>Volyx Lens | Privacy-First Context-Aware AI Assistant</w:t>
       </w:r>
     </w:p>
     <w:p>
@@ -370,37 +392,43 @@
         <w:rPr>
           <w:i/>
         </w:rPr>
-        <w:t>React, Express, Socket.IO, SQLite, Paystack</w:t>
+        <w:t>JavaScript, Electron, Swift, Azure AI Foundry, Multimodal APIs</w:t>
       </w:r>
     </w:p>
     <w:p>
       <w:pPr>
-        <w:pStyle w:val="ListBullet"/>
         <w:spacing w:after="0"/>
         <w:ind w:left="288" w:hanging="173"/>
       </w:pPr>
       <w:r>
-        <w:t>Built signed guest sessions, server-authoritative moves, reconnect and forfeit handling, transactional match settlement, and an append-only currency ledger.</w:t>
+        <w:t>- Developed and substantially extended a macOS assistant that combines explicitly selected screen context, microphone input, and meeting audio with user-configured AI providers.</w:t>
       </w:r>
     </w:p>
     <w:p>
       <w:pPr>
-        <w:pStyle w:val="ListBullet"/>
         <w:spacing w:after="0"/>
         <w:ind w:left="288" w:hanging="173"/>
       </w:pPr>
       <w:r>
-        <w:t>Added one-time crediting for verified Paystack references and automated API, economy, room-state, and two-client Socket.IO tests.</w:t>
+        <w:t>- Implemented local OCR, bounded screenshot memory, context ranking, provider routing, and consent before larger image uploads.</w:t>
       </w:r>
     </w:p>
     <w:p>
       <w:pPr>
-        <w:pStyle w:val="ListBullet"/>
         <w:spacing w:after="0"/>
         <w:ind w:left="288" w:hanging="173"/>
       </w:pPr>
       <w:r>
-        <w:t xml:space="preserve">Live: </w:t>
+        <w:t>- Hardened Electron boundaries with sandboxing, context isolation, restricted IPC, automated tests, secret scanning, and release checks.</w:t>
+      </w:r>
+    </w:p>
+    <w:p>
+      <w:pPr>
+        <w:spacing w:after="0"/>
+        <w:ind w:left="288" w:hanging="173"/>
+      </w:pPr>
+      <w:r>
+        <w:t xml:space="preserve">- Source: </w:t>
       </w:r>
       <w:hyperlink r:id="rId14">
         <w:r>
@@ -408,19 +436,7 @@
             <w:color w:val="1155CC"/>
             <w:u w:val="single"/>
           </w:rPr>
-          <w:t>https://noughtline.onrender.com</w:t>
-        </w:r>
-      </w:hyperlink>
-      <w:r>
-        <w:t xml:space="preserve"> | Source: </w:t>
-      </w:r>
-      <w:hyperlink r:id="rId15">
-        <w:r>
-          <w:rPr>
-            <w:color w:val="1155CC"/>
-            <w:u w:val="single"/>
-          </w:rPr>
-          <w:t>https://github.com/dk3yyyy/Noughtline</w:t>
+          <w:t>https://github.com/dk3yyyy/volyx-lens</w:t>
         </w:r>
       </w:hyperlink>
       <w:r/>
@@ -449,40 +465,37 @@
     </w:p>
     <w:p>
       <w:pPr>
-        <w:pStyle w:val="ListBullet"/>
         <w:spacing w:after="0"/>
         <w:ind w:left="288" w:hanging="173"/>
       </w:pPr>
       <w:r>
-        <w:t>Built data scrapers, temporal feature engineering, XGBoost outcome and Poisson goal models, a FastAPI service, and a Streamlit dashboard.</w:t>
+        <w:t>- Built data scrapers, temporal feature engineering, XGBoost outcome and Poisson goal models, a FastAPI service, and a Streamlit dashboard.</w:t>
       </w:r>
     </w:p>
     <w:p>
       <w:pPr>
-        <w:pStyle w:val="ListBullet"/>
         <w:spacing w:after="0"/>
         <w:ind w:left="288" w:hanging="173"/>
       </w:pPr>
       <w:r>
-        <w:t>Uses chronological train, calibration, and test partitions with probability calibration; no performance claim is published while evaluation work continues.</w:t>
+        <w:t>- Evaluated with rolling-origin testing across 1,140 Premier League matches: 53.77% outcome accuracy versus a 56.70% bookmaker-implied benchmark, showing signal but no practical betting advantage.</w:t>
       </w:r>
     </w:p>
     <w:p>
       <w:pPr>
-        <w:pStyle w:val="ListBullet"/>
         <w:spacing w:after="0"/>
         <w:ind w:left="288" w:hanging="173"/>
       </w:pPr>
       <w:r>
-        <w:t xml:space="preserve">Source: </w:t>
+        <w:t xml:space="preserve">- Archived evidence: </w:t>
       </w:r>
-      <w:hyperlink r:id="rId16">
+      <w:hyperlink r:id="rId15">
         <w:r>
           <w:rPr>
             <w:color w:val="1155CC"/>
             <w:u w:val="single"/>
           </w:rPr>
-          <w:t>https://github.com/dk3yyyy/football_predictor</w:t>
+          <w:t>https://github.com/dk3yyyy/football_predictor/tree/repair/football-predictor-hardening</w:t>
         </w:r>
       </w:hyperlink>
       <w:r/>
@@ -495,7 +508,7 @@
         <w:rPr>
           <w:b/>
         </w:rPr>
-        <w:t>Local Review RAG | Local Retrieval Experiment</w:t>
+        <w:t>Noughtline | Real-Time Multiplayer System</w:t>
       </w:r>
     </w:p>
     <w:p>
@@ -506,27 +519,46 @@
         <w:rPr>
           <w:i/>
         </w:rPr>
-        <w:t>Python, Ollama, LangChain, Chroma, Llama 3.2</w:t>
+        <w:t>React, Express, Socket.IO, SQLite, Paystack</w:t>
       </w:r>
     </w:p>
     <w:p>
       <w:pPr>
-        <w:pStyle w:val="ListBullet"/>
         <w:spacing w:after="0"/>
         <w:ind w:left="288" w:hanging="173"/>
       </w:pPr>
       <w:r>
-        <w:t>Embedded restaurant reviews locally, stored vectors in Chroma, retrieved the five closest records, and supplied that context to a local language model.</w:t>
+        <w:t>- Built signed guest sessions, server-authoritative moves, reconnect and forfeit handling, transactional match settlement, and an append-only currency ledger.</w:t>
       </w:r>
     </w:p>
     <w:p>
       <w:pPr>
-        <w:pStyle w:val="ListBullet"/>
         <w:spacing w:after="0"/>
         <w:ind w:left="288" w:hanging="173"/>
       </w:pPr>
       <w:r>
-        <w:t xml:space="preserve">Source: </w:t>
+        <w:t>- Added idempotent Paystack crediting plus automated API, economy, room-state, and two-client Socket.IO tests.</w:t>
+      </w:r>
+    </w:p>
+    <w:p>
+      <w:pPr>
+        <w:spacing w:after="0"/>
+        <w:ind w:left="288" w:hanging="173"/>
+      </w:pPr>
+      <w:r>
+        <w:t xml:space="preserve">- Live: </w:t>
+      </w:r>
+      <w:hyperlink r:id="rId16">
+        <w:r>
+          <w:rPr>
+            <w:color w:val="1155CC"/>
+            <w:u w:val="single"/>
+          </w:rPr>
+          <w:t>https://noughtline.onrender.com</w:t>
+        </w:r>
+      </w:hyperlink>
+      <w:r>
+        <w:t xml:space="preserve"> | Source: </w:t>
       </w:r>
       <w:hyperlink r:id="rId17">
         <w:r>
@@ -534,7 +566,7 @@
             <w:color w:val="1155CC"/>
             <w:u w:val="single"/>
           </w:rPr>
-          <w:t>https://github.com/dk3yyyy/local_AI_agent</w:t>
+          <w:t>https://github.com/dk3yyyy/Noughtline</w:t>
         </w:r>
       </w:hyperlink>
       <w:r/>
@@ -563,22 +595,20 @@
     </w:p>
     <w:p>
       <w:pPr>
-        <w:pStyle w:val="ListBullet"/>
         <w:spacing w:after="0"/>
         <w:ind w:left="288" w:hanging="173"/>
       </w:pPr>
       <w:r>
-        <w:t>Built asynchronous file, URL, and hash scanning with local SHA-256 lookup, VirusTotal large-file upload handling, bounded retry backoff, and short-lived report caching.</w:t>
+        <w:t>- Built asynchronous file, URL, and hash scanning with local SHA-256 lookup, VirusTotal large-file upload handling, bounded retry backoff, and short-lived report caching.</w:t>
       </w:r>
     </w:p>
     <w:p>
       <w:pPr>
-        <w:pStyle w:val="ListBullet"/>
         <w:spacing w:after="0"/>
         <w:ind w:left="288" w:hanging="173"/>
       </w:pPr>
       <w:r>
-        <w:t xml:space="preserve">Source: </w:t>
+        <w:t xml:space="preserve">- Source: </w:t>
       </w:r>
       <w:hyperlink r:id="rId18">
         <w:r>
@@ -600,99 +630,25 @@
           <w:b/>
           <w:sz w:val="23"/>
         </w:rPr>
-        <w:t>CORE SKILLS</w:t>
-      </w:r>
-    </w:p>
-    <w:p>
-      <w:pPr>
-        <w:pStyle w:val="ListBullet"/>
-        <w:spacing w:after="0"/>
-        <w:ind w:left="288" w:hanging="173"/>
-      </w:pPr>
-      <w:r>
-        <w:t>Languages: Python, JavaScript, TypeScript, SQL</w:t>
-      </w:r>
-    </w:p>
-    <w:p>
-      <w:pPr>
-        <w:pStyle w:val="ListBullet"/>
-        <w:spacing w:after="0"/>
-        <w:ind w:left="288" w:hanging="173"/>
-      </w:pPr>
-      <w:r>
-        <w:t>AI / ML: XGBoost, scikit-learn, pandas, Ollama, LangChain, Chroma, retrieval workflows, structured outputs</w:t>
-      </w:r>
-    </w:p>
-    <w:p>
-      <w:pPr>
-        <w:pStyle w:val="ListBullet"/>
-        <w:spacing w:after="0"/>
-        <w:ind w:left="288" w:hanging="173"/>
-      </w:pPr>
-      <w:r>
-        <w:t>Backend: FastAPI, Express, Socket.IO, SQLAlchemy, SQLite, PostgreSQL, REST APIs, webhooks</w:t>
-      </w:r>
-    </w:p>
-    <w:p>
-      <w:pPr>
-        <w:pStyle w:val="ListBullet"/>
-        <w:spacing w:after="0"/>
-        <w:ind w:left="288" w:hanging="173"/>
-      </w:pPr>
-      <w:r>
-        <w:t>Automation: n8n, approval gates, retries, idempotency, Telegram integrations, Google Calendar and email workflows</w:t>
-      </w:r>
-    </w:p>
-    <w:p>
-      <w:pPr>
-        <w:pStyle w:val="ListBullet"/>
-        <w:spacing w:after="0"/>
-        <w:ind w:left="288" w:hanging="173"/>
-      </w:pPr>
-      <w:r>
-        <w:t>Infrastructure: Docker, GitHub Actions, Linux, Microsoft Azure, Azure AI Foundry, GitHub Pages, Cloudflare Pages</w:t>
-      </w:r>
-    </w:p>
-    <w:p>
-      <w:pPr>
-        <w:pStyle w:val="ListBullet"/>
-        <w:spacing w:after="0"/>
-        <w:ind w:left="288" w:hanging="173"/>
-      </w:pPr>
-      <w:r>
-        <w:t>Security: Suricata, Snort, VirusTotal API, OSINT, DNS analysis, credential handling</w:t>
-      </w:r>
-    </w:p>
-    <w:p>
-      <w:pPr>
-        <w:spacing w:before="120" w:after="40"/>
-      </w:pPr>
-      <w:r>
-        <w:rPr>
-          <w:b/>
-          <w:sz w:val="23"/>
-        </w:rPr>
         <w:t>CERTIFICATIONS</w:t>
       </w:r>
     </w:p>
     <w:p>
       <w:pPr>
-        <w:pStyle w:val="ListBullet"/>
         <w:spacing w:after="0"/>
         <w:ind w:left="288" w:hanging="173"/>
       </w:pPr>
       <w:r>
-        <w:t>Google AI Professional Certificate | Coursera</w:t>
+        <w:t>- Google AI Professional Certificate | Coursera</w:t>
       </w:r>
     </w:p>
     <w:p>
       <w:pPr>
-        <w:pStyle w:val="ListBullet"/>
         <w:spacing w:after="0"/>
         <w:ind w:left="288" w:hanging="173"/>
       </w:pPr>
       <w:r>
-        <w:t>Google Cybersecurity Professional Certificate | Coursera</w:t>
+        <w:t>- Google Cybersecurity Professional Certificate | Coursera</w:t>
       </w:r>
     </w:p>
     <w:p>

</xml_diff>